<commit_message>
Show read-only asset info for QR scans
</commit_message>
<xml_diff>
--- a/ASSET_QR_MANAGER_QA.docx
+++ b/ASSET_QR_MANAGER_QA.docx
@@ -1782,7 +1782,7 @@
           <w:color w:val="111827"/>
           <w:sz w:val="18"/>
         </w:rPr>
-        <w:t>https://asset-bipum-management.vercel.app/?asset=ADM-DESK-2605-001#assets</w:t>
+        <w:t>https://asset-bipum-management.vercel.app/?asset=ADM-DESK-2605-001</w:t>
       </w:r>
     </w:p>
     <w:p>
@@ -1790,7 +1790,7 @@
         <w:rPr>
           <w:rFonts w:ascii="Malgun Gothic" w:hAnsi="Malgun Gothic" w:eastAsia="Malgun Gothic"/>
         </w:rPr>
-        <w:t>따라서 새로 출력한 QR 스티커는 휴대폰 카메라로 스캔하면 앱이 열리고 해당 비품이 자동 선택됩니다.</w:t>
+        <w:t>따라서 새로 출력한 QR 스티커는 휴대폰 카메라로 스캔하면 관리 대시보드가 아니라 해당 비품의 읽기 전용 정보 화면이 열립니다.</w:t>
       </w:r>
     </w:p>
     <w:p>
@@ -1874,7 +1874,7 @@
         <w:rPr>
           <w:rFonts w:ascii="Malgun Gothic" w:hAnsi="Malgun Gothic" w:eastAsia="Malgun Gothic"/>
         </w:rPr>
-        <w:t>QR 스캔으로 앱이 열리면 해당 비품이 목록에서 자동 선택되고 상세 화면과 QR 스티커 화면에서 바로 확인할 수 있습니다.</w:t>
+        <w:t>QR 스캔으로 앱이 열리면 대시보드, 등록, CSV, 스티커 인쇄 같은 관리 기능은 숨겨지고 해당 비품의 사진, 상태, 위치, 사용자, 모델, 시리얼 등 확인 정보만 표시됩니다.</w:t>
       </w:r>
     </w:p>
     <w:p>

</xml_diff>